<commit_message>
ajuste timout e geração do relatório em PDF
</commit_message>
<xml_diff>
--- a/Relatorio_Tecnico_Otimizador_Rotas_Hospitalares_Assistente_Logistico_IA.docx
+++ b/Relatorio_Tecnico_Otimizador_Rotas_Hospitalares_Assistente_Logistico_IA.docx
@@ -551,28 +551,27 @@
         <w:spacing w:after="200" w:line="360" w:lineRule="auto"/>
         <w:jc w:val="both"/>
         <w:rPr>
-          <w:rFonts w:ascii="Arial" w:cs="Arial" w:eastAsia="Arial" w:hAnsi="Arial"/>
-        </w:rPr>
-      </w:pPr>
-      <w:r>
-        <w:rPr>
-          <w:rFonts w:ascii="Arial" w:cs="Arial" w:eastAsia="Arial" w:hAnsi="Arial"/>
-        </w:rPr>
+          <w:rFonts w:ascii="Arial" w:hAnsi="Arial" w:eastAsia="Arial" w:cs="Arial"/>
+        </w:rPr>
+      </w:pPr>
+      <w:r>
         <w:drawing>
-          <wp:inline distB="0" distT="0" distL="0" distR="0">
-            <wp:extent cx="5648325" cy="1613395"/>
-            <wp:effectExtent b="0" l="0" r="0" t="0"/>
-            <wp:docPr descr="image.png" id="9" name="image4.png"/>
-            <a:graphic>
+          <wp:inline distT="0" distB="0" distL="0" distR="0">
+            <wp:extent cx="5438775" cy="1552575"/>
+            <wp:effectExtent l="0" t="0" r="0" b="0"/>
+            <wp:docPr id="100001" name="Picture 100001" descr="image.png"/>
+            <wp:cNvGraphicFramePr>
+              <a:graphicFrameLocks xmlns:a="http://schemas.openxmlformats.org/drawingml/2006/main" noChangeAspect="1"/>
+            </wp:cNvGraphicFramePr>
+            <a:graphic xmlns:a="http://schemas.openxmlformats.org/drawingml/2006/main">
               <a:graphicData uri="http://schemas.openxmlformats.org/drawingml/2006/picture">
-                <pic:pic>
+                <pic:pic xmlns:pic="http://schemas.openxmlformats.org/drawingml/2006/picture">
                   <pic:nvPicPr>
-                    <pic:cNvPr descr="image.png" id="0" name="image4.png"/>
-                    <pic:cNvPicPr preferRelativeResize="0"/>
+                    <pic:cNvPr id="100001" name="image100001" descr="image.png"/>
+                    <pic:cNvPicPr/>
                   </pic:nvPicPr>
                   <pic:blipFill>
                     <a:blip r:embed="rId7"/>
-                    <a:srcRect b="0" l="0" r="0" t="0"/>
                     <a:stretch>
                       <a:fillRect/>
                     </a:stretch>
@@ -580,10 +579,11 @@
                   <pic:spPr>
                     <a:xfrm>
                       <a:off x="0" y="0"/>
-                      <a:ext cx="5648325" cy="1613395"/>
+                      <a:ext cx="5438775" cy="1552575"/>
                     </a:xfrm>
-                    <a:prstGeom prst="rect"/>
-                    <a:ln/>
+                    <a:prstGeom prst="rect">
+                      <a:avLst/>
+                    </a:prstGeom>
                   </pic:spPr>
                 </pic:pic>
               </a:graphicData>
@@ -591,38 +591,32 @@
           </wp:inline>
         </w:drawing>
       </w:r>
-      <w:r>
-        <w:rPr>
-          <w:rtl w:val="0"/>
-        </w:rPr>
-      </w:r>
-    </w:p>
-    <w:p>
-      <w:pPr>
-        <w:spacing w:after="200" w:line="360" w:lineRule="auto"/>
-        <w:rPr>
-          <w:rFonts w:ascii="Arial" w:cs="Arial" w:eastAsia="Arial" w:hAnsi="Arial"/>
-        </w:rPr>
-      </w:pPr>
-      <w:r>
-        <w:rPr>
-          <w:rFonts w:ascii="Arial" w:cs="Arial" w:eastAsia="Arial" w:hAnsi="Arial"/>
-        </w:rPr>
+    </w:p>
+    <w:p>
+      <w:pPr>
+        <w:spacing w:after="200" w:line="360" w:lineRule="auto"/>
+        <w:rPr>
+          <w:rFonts w:ascii="Arial" w:hAnsi="Arial" w:eastAsia="Arial" w:cs="Arial"/>
+        </w:rPr>
+      </w:pPr>
+      <w:r>
         <w:drawing>
-          <wp:inline distB="0" distT="0" distL="0" distR="0">
-            <wp:extent cx="5883017" cy="3738563"/>
-            <wp:effectExtent b="0" l="0" r="0" t="0"/>
-            <wp:docPr descr="image.png" id="3" name="image1.png"/>
-            <a:graphic>
+          <wp:inline distT="0" distB="0" distL="0" distR="0">
+            <wp:extent cx="5429250" cy="3448050"/>
+            <wp:effectExtent l="0" t="0" r="0" b="0"/>
+            <wp:docPr id="100002" name="Picture 100002" descr="image.png"/>
+            <wp:cNvGraphicFramePr>
+              <a:graphicFrameLocks xmlns:a="http://schemas.openxmlformats.org/drawingml/2006/main" noChangeAspect="1"/>
+            </wp:cNvGraphicFramePr>
+            <a:graphic xmlns:a="http://schemas.openxmlformats.org/drawingml/2006/main">
               <a:graphicData uri="http://schemas.openxmlformats.org/drawingml/2006/picture">
-                <pic:pic>
+                <pic:pic xmlns:pic="http://schemas.openxmlformats.org/drawingml/2006/picture">
                   <pic:nvPicPr>
-                    <pic:cNvPr descr="image.png" id="0" name="image1.png"/>
-                    <pic:cNvPicPr preferRelativeResize="0"/>
+                    <pic:cNvPr id="100002" name="image100002" descr="image.png"/>
+                    <pic:cNvPicPr/>
                   </pic:nvPicPr>
                   <pic:blipFill>
                     <a:blip r:embed="rId8"/>
-                    <a:srcRect b="0" l="0" r="0" t="0"/>
                     <a:stretch>
                       <a:fillRect/>
                     </a:stretch>
@@ -630,10 +624,11 @@
                   <pic:spPr>
                     <a:xfrm>
                       <a:off x="0" y="0"/>
-                      <a:ext cx="5883017" cy="3738563"/>
+                      <a:ext cx="5429250" cy="3448050"/>
                     </a:xfrm>
-                    <a:prstGeom prst="rect"/>
-                    <a:ln/>
+                    <a:prstGeom prst="rect">
+                      <a:avLst/>
+                    </a:prstGeom>
                   </pic:spPr>
                 </pic:pic>
               </a:graphicData>
@@ -641,38 +636,32 @@
           </wp:inline>
         </w:drawing>
       </w:r>
-      <w:r>
-        <w:rPr>
-          <w:rtl w:val="0"/>
-        </w:rPr>
-      </w:r>
     </w:p>
     <w:p>
       <w:pPr>
         <w:spacing w:line="360" w:lineRule="auto"/>
         <w:rPr>
-          <w:rFonts w:ascii="Arial" w:cs="Arial" w:eastAsia="Arial" w:hAnsi="Arial"/>
-        </w:rPr>
-      </w:pPr>
-      <w:r>
-        <w:rPr>
-          <w:rFonts w:ascii="Arial" w:cs="Arial" w:eastAsia="Arial" w:hAnsi="Arial"/>
-        </w:rPr>
+          <w:rFonts w:ascii="Arial" w:hAnsi="Arial" w:eastAsia="Arial" w:cs="Arial"/>
+        </w:rPr>
+      </w:pPr>
+      <w:r>
         <w:drawing>
-          <wp:inline distB="0" distT="0" distL="0" distR="0">
-            <wp:extent cx="5872163" cy="3727465"/>
-            <wp:effectExtent b="0" l="0" r="0" t="0"/>
-            <wp:docPr descr="image.png" id="1" name="image3.png"/>
-            <a:graphic>
+          <wp:inline distT="0" distB="0" distL="0" distR="0">
+            <wp:extent cx="5429250" cy="3438525"/>
+            <wp:effectExtent l="0" t="0" r="0" b="0"/>
+            <wp:docPr id="100003" name="Picture 100003" descr="image.png"/>
+            <wp:cNvGraphicFramePr>
+              <a:graphicFrameLocks xmlns:a="http://schemas.openxmlformats.org/drawingml/2006/main" noChangeAspect="1"/>
+            </wp:cNvGraphicFramePr>
+            <a:graphic xmlns:a="http://schemas.openxmlformats.org/drawingml/2006/main">
               <a:graphicData uri="http://schemas.openxmlformats.org/drawingml/2006/picture">
-                <pic:pic>
+                <pic:pic xmlns:pic="http://schemas.openxmlformats.org/drawingml/2006/picture">
                   <pic:nvPicPr>
-                    <pic:cNvPr descr="image.png" id="0" name="image3.png"/>
-                    <pic:cNvPicPr preferRelativeResize="0"/>
+                    <pic:cNvPr id="100003" name="image100003" descr="image.png"/>
+                    <pic:cNvPicPr/>
                   </pic:nvPicPr>
                   <pic:blipFill>
                     <a:blip r:embed="rId9"/>
-                    <a:srcRect b="0" l="0" r="0" t="0"/>
                     <a:stretch>
                       <a:fillRect/>
                     </a:stretch>
@@ -680,10 +669,11 @@
                   <pic:spPr>
                     <a:xfrm>
                       <a:off x="0" y="0"/>
-                      <a:ext cx="5872163" cy="3727465"/>
+                      <a:ext cx="5429250" cy="3438525"/>
                     </a:xfrm>
-                    <a:prstGeom prst="rect"/>
-                    <a:ln/>
+                    <a:prstGeom prst="rect">
+                      <a:avLst/>
+                    </a:prstGeom>
                   </pic:spPr>
                 </pic:pic>
               </a:graphicData>
@@ -691,38 +681,32 @@
           </wp:inline>
         </w:drawing>
       </w:r>
-      <w:r>
-        <w:rPr>
-          <w:rtl w:val="0"/>
-        </w:rPr>
-      </w:r>
-    </w:p>
-    <w:p>
-      <w:pPr>
-        <w:spacing w:after="200" w:line="360" w:lineRule="auto"/>
-        <w:rPr>
-          <w:rFonts w:ascii="Arial" w:cs="Arial" w:eastAsia="Arial" w:hAnsi="Arial"/>
-        </w:rPr>
-      </w:pPr>
-      <w:r>
-        <w:rPr>
-          <w:rFonts w:ascii="Arial" w:cs="Arial" w:eastAsia="Arial" w:hAnsi="Arial"/>
-        </w:rPr>
+    </w:p>
+    <w:p>
+      <w:pPr>
+        <w:spacing w:after="200" w:line="360" w:lineRule="auto"/>
+        <w:rPr>
+          <w:rFonts w:ascii="Arial" w:hAnsi="Arial" w:eastAsia="Arial" w:cs="Arial"/>
+        </w:rPr>
+      </w:pPr>
+      <w:r>
         <w:drawing>
-          <wp:inline distB="0" distT="0" distL="0" distR="0">
-            <wp:extent cx="5824538" cy="3555092"/>
-            <wp:effectExtent b="0" l="0" r="0" t="0"/>
-            <wp:docPr descr="image.png" id="6" name="image6.png"/>
-            <a:graphic>
+          <wp:inline distT="0" distB="0" distL="0" distR="0">
+            <wp:extent cx="5391150" cy="3286125"/>
+            <wp:effectExtent l="0" t="0" r="0" b="0"/>
+            <wp:docPr id="100004" name="Picture 100004" descr="image.png"/>
+            <wp:cNvGraphicFramePr>
+              <a:graphicFrameLocks xmlns:a="http://schemas.openxmlformats.org/drawingml/2006/main" noChangeAspect="1"/>
+            </wp:cNvGraphicFramePr>
+            <a:graphic xmlns:a="http://schemas.openxmlformats.org/drawingml/2006/main">
               <a:graphicData uri="http://schemas.openxmlformats.org/drawingml/2006/picture">
-                <pic:pic>
+                <pic:pic xmlns:pic="http://schemas.openxmlformats.org/drawingml/2006/picture">
                   <pic:nvPicPr>
-                    <pic:cNvPr descr="image.png" id="0" name="image6.png"/>
-                    <pic:cNvPicPr preferRelativeResize="0"/>
+                    <pic:cNvPr id="100004" name="image100004" descr="image.png"/>
+                    <pic:cNvPicPr/>
                   </pic:nvPicPr>
                   <pic:blipFill>
                     <a:blip r:embed="rId10"/>
-                    <a:srcRect b="0" l="0" r="0" t="0"/>
                     <a:stretch>
                       <a:fillRect/>
                     </a:stretch>
@@ -730,10 +714,11 @@
                   <pic:spPr>
                     <a:xfrm>
                       <a:off x="0" y="0"/>
-                      <a:ext cx="5824538" cy="3555092"/>
+                      <a:ext cx="5391150" cy="3286125"/>
                     </a:xfrm>
-                    <a:prstGeom prst="rect"/>
-                    <a:ln/>
+                    <a:prstGeom prst="rect">
+                      <a:avLst/>
+                    </a:prstGeom>
                   </pic:spPr>
                 </pic:pic>
               </a:graphicData>
@@ -742,24 +727,23 @@
         </w:drawing>
       </w:r>
       <w:r>
-        <w:rPr>
-          <w:rFonts w:ascii="Arial" w:cs="Arial" w:eastAsia="Arial" w:hAnsi="Arial"/>
-        </w:rPr>
         <w:drawing>
-          <wp:inline distB="0" distT="0" distL="0" distR="0">
+          <wp:inline distT="0" distB="0" distL="0" distR="0">
             <wp:extent cx="5829300" cy="3781425"/>
-            <wp:effectExtent b="0" l="0" r="0" t="0"/>
-            <wp:docPr descr="image.png" id="4" name="image2.png"/>
-            <a:graphic>
+            <wp:effectExtent l="0" t="0" r="0" b="0"/>
+            <wp:docPr id="100005" name="Picture 100005" descr="image.png"/>
+            <wp:cNvGraphicFramePr>
+              <a:graphicFrameLocks xmlns:a="http://schemas.openxmlformats.org/drawingml/2006/main" noChangeAspect="1"/>
+            </wp:cNvGraphicFramePr>
+            <a:graphic xmlns:a="http://schemas.openxmlformats.org/drawingml/2006/main">
               <a:graphicData uri="http://schemas.openxmlformats.org/drawingml/2006/picture">
-                <pic:pic>
+                <pic:pic xmlns:pic="http://schemas.openxmlformats.org/drawingml/2006/picture">
                   <pic:nvPicPr>
-                    <pic:cNvPr descr="image.png" id="0" name="image2.png"/>
-                    <pic:cNvPicPr preferRelativeResize="0"/>
+                    <pic:cNvPr id="100005" name="image100005" descr="image.png"/>
+                    <pic:cNvPicPr/>
                   </pic:nvPicPr>
                   <pic:blipFill>
                     <a:blip r:embed="rId11"/>
-                    <a:srcRect b="0" l="0" r="0" t="0"/>
                     <a:stretch>
                       <a:fillRect/>
                     </a:stretch>
@@ -769,8 +753,9 @@
                       <a:off x="0" y="0"/>
                       <a:ext cx="5829300" cy="3781425"/>
                     </a:xfrm>
-                    <a:prstGeom prst="rect"/>
-                    <a:ln/>
+                    <a:prstGeom prst="rect">
+                      <a:avLst/>
+                    </a:prstGeom>
                   </pic:spPr>
                 </pic:pic>
               </a:graphicData>
@@ -778,11 +763,6 @@
           </wp:inline>
         </w:drawing>
       </w:r>
-      <w:r>
-        <w:rPr>
-          <w:rtl w:val="0"/>
-        </w:rPr>
-      </w:r>
     </w:p>
     <w:p>
       <w:pPr>
@@ -841,35 +821,18 @@
         <w:ind w:firstLine="720"/>
         <w:jc w:val="both"/>
         <w:rPr>
-          <w:rFonts w:ascii="Arial" w:cs="Arial" w:eastAsia="Arial" w:hAnsi="Arial"/>
-          <w:sz w:val="22"/>
-          <w:szCs w:val="22"/>
-        </w:rPr>
-      </w:pPr>
-      <w:r>
-        <w:rPr>
-          <w:rFonts w:ascii="Arial" w:cs="Arial" w:eastAsia="Arial" w:hAnsi="Arial"/>
-          <w:sz w:val="22"/>
-          <w:szCs w:val="22"/>
-          <w:rtl w:val="0"/>
-        </w:rPr>
-        <w:t xml:space="preserve">Os resultados mostraram que a solução evolutiva apresentou melhor desempenho em cenários com múltiplas restrições, alcançando fitness superior e maior capacidade de equilibrar entregas entre veículos.</w:t>
-      </w:r>
-      <w:r>
-        <w:rPr>
-          <w:rFonts w:ascii="Arial" w:cs="Arial" w:eastAsia="Arial" w:hAnsi="Arial"/>
-          <w:rtl w:val="0"/>
-        </w:rPr>
-        <w:t xml:space="preserve"> </w:t>
-      </w:r>
-      <w:r>
-        <w:rPr>
-          <w:rFonts w:ascii="Arial" w:cs="Arial" w:eastAsia="Arial" w:hAnsi="Arial"/>
-          <w:sz w:val="22"/>
-          <w:szCs w:val="22"/>
-          <w:rtl w:val="0"/>
-        </w:rPr>
-        <w:t xml:space="preserve">Além disso, a análise das rotas permitiu verificar a distribuição das entregas, a utilização de capacidade e autonomia, e a presença de prioridades críticas em posições adequadas. </w:t>
+          <w:rFonts w:ascii="Arial" w:hAnsi="Arial" w:eastAsia="Arial" w:cs="Arial"/>
+          <w:sz w:val="22"/>
+          <w:szCs w:val="22"/>
+        </w:rPr>
+      </w:pPr>
+      <w:r>
+        <w:rPr>
+          <w:rFonts w:ascii="Arial" w:hAnsi="Arial" w:eastAsia="Arial" w:cs="Arial"/>
+          <w:sz w:val="22"/>
+          <w:szCs w:val="22"/>
+        </w:rPr>
+        <w:t xml:space="preserve">Os resultados mostraram que a solução evolutiva apresentou melhor desempenho em cenários com múltiplas restrições, alcançando fitness superior e maior capacidade de equilibrar entregas entre veículos. Além disso, a análise das rotas permitiu verificar a distribuição das entregas, a utilização de capacidade e autonomia, e a presença de prioridades críticas em posições adequadas.  </w:t>
       </w:r>
     </w:p>
     <w:p>
@@ -908,28 +871,27 @@
         <w:spacing w:after="200" w:line="360" w:lineRule="auto"/>
         <w:jc w:val="center"/>
         <w:rPr>
-          <w:rFonts w:ascii="Arial" w:cs="Arial" w:eastAsia="Arial" w:hAnsi="Arial"/>
-        </w:rPr>
-      </w:pPr>
-      <w:r>
-        <w:rPr>
-          <w:rFonts w:ascii="Arial" w:cs="Arial" w:eastAsia="Arial" w:hAnsi="Arial"/>
-        </w:rPr>
+          <w:rFonts w:ascii="Arial" w:hAnsi="Arial" w:eastAsia="Arial" w:cs="Arial"/>
+        </w:rPr>
+      </w:pPr>
+      <w:r>
         <w:drawing>
-          <wp:inline distB="114300" distT="114300" distL="114300" distR="114300">
-            <wp:extent cx="5898224" cy="2590713"/>
-            <wp:effectExtent b="0" l="0" r="0" t="0"/>
-            <wp:docPr id="8" name="image7.png"/>
-            <a:graphic>
+          <wp:inline distT="114300" distB="114300" distL="114300" distR="114300">
+            <wp:extent cx="5400675" cy="2371725"/>
+            <wp:effectExtent l="0" t="0" r="0" b="0"/>
+            <wp:docPr id="100006" name="Picture 100006"/>
+            <wp:cNvGraphicFramePr>
+              <a:graphicFrameLocks xmlns:a="http://schemas.openxmlformats.org/drawingml/2006/main" noChangeAspect="1"/>
+            </wp:cNvGraphicFramePr>
+            <a:graphic xmlns:a="http://schemas.openxmlformats.org/drawingml/2006/main">
               <a:graphicData uri="http://schemas.openxmlformats.org/drawingml/2006/picture">
-                <pic:pic>
+                <pic:pic xmlns:pic="http://schemas.openxmlformats.org/drawingml/2006/picture">
                   <pic:nvPicPr>
-                    <pic:cNvPr id="0" name="image7.png"/>
-                    <pic:cNvPicPr preferRelativeResize="0"/>
+                    <pic:cNvPr id="100006" name="image100006"/>
+                    <pic:cNvPicPr/>
                   </pic:nvPicPr>
                   <pic:blipFill>
                     <a:blip r:embed="rId12"/>
-                    <a:srcRect b="0" l="0" r="0" t="0"/>
                     <a:stretch>
                       <a:fillRect/>
                     </a:stretch>
@@ -937,10 +899,11 @@
                   <pic:spPr>
                     <a:xfrm>
                       <a:off x="0" y="0"/>
-                      <a:ext cx="5898224" cy="2590713"/>
+                      <a:ext cx="5400675" cy="2371725"/>
                     </a:xfrm>
-                    <a:prstGeom prst="rect"/>
-                    <a:ln/>
+                    <a:prstGeom prst="rect">
+                      <a:avLst/>
+                    </a:prstGeom>
                   </pic:spPr>
                 </pic:pic>
               </a:graphicData>
@@ -948,38 +911,32 @@
           </wp:inline>
         </w:drawing>
       </w:r>
-      <w:r>
-        <w:rPr>
-          <w:rtl w:val="0"/>
-        </w:rPr>
-      </w:r>
-    </w:p>
-    <w:p>
-      <w:pPr>
-        <w:spacing w:after="200" w:line="360" w:lineRule="auto"/>
-        <w:rPr>
-          <w:rFonts w:ascii="Arial" w:cs="Arial" w:eastAsia="Arial" w:hAnsi="Arial"/>
-        </w:rPr>
-      </w:pPr>
-      <w:r>
-        <w:rPr>
-          <w:rFonts w:ascii="Arial" w:cs="Arial" w:eastAsia="Arial" w:hAnsi="Arial"/>
-        </w:rPr>
+    </w:p>
+    <w:p>
+      <w:pPr>
+        <w:spacing w:after="200" w:line="360" w:lineRule="auto"/>
+        <w:rPr>
+          <w:rFonts w:ascii="Arial" w:hAnsi="Arial" w:eastAsia="Arial" w:cs="Arial"/>
+        </w:rPr>
+      </w:pPr>
+      <w:r>
         <w:drawing>
-          <wp:inline distB="114300" distT="114300" distL="114300" distR="114300">
-            <wp:extent cx="5862918" cy="3633788"/>
-            <wp:effectExtent b="0" l="0" r="0" t="0"/>
-            <wp:docPr id="5" name="image8.png"/>
-            <a:graphic>
+          <wp:inline distT="114300" distB="114300" distL="114300" distR="114300">
+            <wp:extent cx="5391150" cy="3343275"/>
+            <wp:effectExtent l="0" t="0" r="0" b="0"/>
+            <wp:docPr id="100007" name="Picture 100007"/>
+            <wp:cNvGraphicFramePr>
+              <a:graphicFrameLocks xmlns:a="http://schemas.openxmlformats.org/drawingml/2006/main" noChangeAspect="1"/>
+            </wp:cNvGraphicFramePr>
+            <a:graphic xmlns:a="http://schemas.openxmlformats.org/drawingml/2006/main">
               <a:graphicData uri="http://schemas.openxmlformats.org/drawingml/2006/picture">
-                <pic:pic>
+                <pic:pic xmlns:pic="http://schemas.openxmlformats.org/drawingml/2006/picture">
                   <pic:nvPicPr>
-                    <pic:cNvPr id="0" name="image8.png"/>
-                    <pic:cNvPicPr preferRelativeResize="0"/>
+                    <pic:cNvPr id="100007" name="image100007"/>
+                    <pic:cNvPicPr/>
                   </pic:nvPicPr>
                   <pic:blipFill>
                     <a:blip r:embed="rId13"/>
-                    <a:srcRect b="0" l="0" r="0" t="0"/>
                     <a:stretch>
                       <a:fillRect/>
                     </a:stretch>
@@ -987,21 +944,17 @@
                   <pic:spPr>
                     <a:xfrm>
                       <a:off x="0" y="0"/>
-                      <a:ext cx="5862918" cy="3633788"/>
+                      <a:ext cx="5391150" cy="3343275"/>
                     </a:xfrm>
-                    <a:prstGeom prst="rect"/>
-                    <a:ln/>
+                    <a:prstGeom prst="rect">
+                      <a:avLst/>
+                    </a:prstGeom>
                   </pic:spPr>
                 </pic:pic>
               </a:graphicData>
             </a:graphic>
           </wp:inline>
         </w:drawing>
-      </w:r>
-      <w:r>
-        <w:rPr>
-          <w:rtl w:val="0"/>
-        </w:rPr>
       </w:r>
     </w:p>
     <w:p>

</xml_diff>